<commit_message>
Align README setup with the CI install
A fresh-clone check showed that the documented `pip install -e .` followed by
`pytest -q` fails at collection: the drift and orchestration tests import
Evidently and Prefect from the optional extras. Install
`.[dev,orchestration,monitoring]` as CI does, explain the extras, and add the
install step to the report's reproduction appendix.

Co-authored-by: Copilot <223556219+Copilot@users.noreply.github.com>
</commit_message>
<xml_diff>
--- a/docs/deliverables/EV_Charge_MLOps_Technical_Report.docx
+++ b/docs/deliverables/EV_Charge_MLOps_Technical_Report.docx
@@ -280,7 +280,7 @@
       <w:r>
         <w:fldChar w:fldCharType="separate"/>
       </w:r>
-      <w:hyperlink w:anchor="_Toc243413793" w:history="1">
+      <w:hyperlink w:anchor="_Toc243417592" w:history="1">
         <w:r>
           <w:rPr>
             <w:rStyle w:val="Hyperlink"/>
@@ -307,7 +307,7 @@
             <w:noProof/>
             <w:webHidden/>
           </w:rPr>
-          <w:instrText xml:space="preserve"> PAGEREF _Toc243413793 \h </w:instrText>
+          <w:instrText xml:space="preserve"> PAGEREF _Toc243417592 \h </w:instrText>
         </w:r>
         <w:r>
           <w:rPr>
@@ -348,7 +348,7 @@
           <w:noProof/>
         </w:rPr>
       </w:pPr>
-      <w:hyperlink w:anchor="_Toc243413794" w:history="1">
+      <w:hyperlink w:anchor="_Toc243417593" w:history="1">
         <w:r>
           <w:rPr>
             <w:rStyle w:val="Hyperlink"/>
@@ -375,7 +375,7 @@
             <w:noProof/>
             <w:webHidden/>
           </w:rPr>
-          <w:instrText xml:space="preserve"> PAGEREF _Toc243413794 \h </w:instrText>
+          <w:instrText xml:space="preserve"> PAGEREF _Toc243417593 \h </w:instrText>
         </w:r>
         <w:r>
           <w:rPr>
@@ -416,7 +416,7 @@
           <w:noProof/>
         </w:rPr>
       </w:pPr>
-      <w:hyperlink w:anchor="_Toc243413795" w:history="1">
+      <w:hyperlink w:anchor="_Toc243417594" w:history="1">
         <w:r>
           <w:rPr>
             <w:rStyle w:val="Hyperlink"/>
@@ -443,7 +443,7 @@
             <w:noProof/>
             <w:webHidden/>
           </w:rPr>
-          <w:instrText xml:space="preserve"> PAGEREF _Toc243413795 \h </w:instrText>
+          <w:instrText xml:space="preserve"> PAGEREF _Toc243417594 \h </w:instrText>
         </w:r>
         <w:r>
           <w:rPr>
@@ -484,7 +484,7 @@
           <w:noProof/>
         </w:rPr>
       </w:pPr>
-      <w:hyperlink w:anchor="_Toc243413796" w:history="1">
+      <w:hyperlink w:anchor="_Toc243417595" w:history="1">
         <w:r>
           <w:rPr>
             <w:rStyle w:val="Hyperlink"/>
@@ -511,7 +511,7 @@
             <w:noProof/>
             <w:webHidden/>
           </w:rPr>
-          <w:instrText xml:space="preserve"> PAGEREF _Toc243413796 \h </w:instrText>
+          <w:instrText xml:space="preserve"> PAGEREF _Toc243417595 \h </w:instrText>
         </w:r>
         <w:r>
           <w:rPr>
@@ -552,7 +552,7 @@
           <w:noProof/>
         </w:rPr>
       </w:pPr>
-      <w:hyperlink w:anchor="_Toc243413797" w:history="1">
+      <w:hyperlink w:anchor="_Toc243417596" w:history="1">
         <w:r>
           <w:rPr>
             <w:rStyle w:val="Hyperlink"/>
@@ -579,7 +579,7 @@
             <w:noProof/>
             <w:webHidden/>
           </w:rPr>
-          <w:instrText xml:space="preserve"> PAGEREF _Toc243413797 \h </w:instrText>
+          <w:instrText xml:space="preserve"> PAGEREF _Toc243417596 \h </w:instrText>
         </w:r>
         <w:r>
           <w:rPr>
@@ -620,7 +620,7 @@
           <w:noProof/>
         </w:rPr>
       </w:pPr>
-      <w:hyperlink w:anchor="_Toc243413798" w:history="1">
+      <w:hyperlink w:anchor="_Toc243417597" w:history="1">
         <w:r>
           <w:rPr>
             <w:rStyle w:val="Hyperlink"/>
@@ -647,7 +647,7 @@
             <w:noProof/>
             <w:webHidden/>
           </w:rPr>
-          <w:instrText xml:space="preserve"> PAGEREF _Toc243413798 \h </w:instrText>
+          <w:instrText xml:space="preserve"> PAGEREF _Toc243417597 \h </w:instrText>
         </w:r>
         <w:r>
           <w:rPr>
@@ -688,7 +688,7 @@
           <w:noProof/>
         </w:rPr>
       </w:pPr>
-      <w:hyperlink w:anchor="_Toc243413799" w:history="1">
+      <w:hyperlink w:anchor="_Toc243417598" w:history="1">
         <w:r>
           <w:rPr>
             <w:rStyle w:val="Hyperlink"/>
@@ -715,7 +715,7 @@
             <w:noProof/>
             <w:webHidden/>
           </w:rPr>
-          <w:instrText xml:space="preserve"> PAGEREF _Toc243413799 \h </w:instrText>
+          <w:instrText xml:space="preserve"> PAGEREF _Toc243417598 \h </w:instrText>
         </w:r>
         <w:r>
           <w:rPr>
@@ -756,7 +756,7 @@
           <w:noProof/>
         </w:rPr>
       </w:pPr>
-      <w:hyperlink w:anchor="_Toc243413800" w:history="1">
+      <w:hyperlink w:anchor="_Toc243417599" w:history="1">
         <w:r>
           <w:rPr>
             <w:rStyle w:val="Hyperlink"/>
@@ -783,7 +783,7 @@
             <w:noProof/>
             <w:webHidden/>
           </w:rPr>
-          <w:instrText xml:space="preserve"> PAGEREF _Toc243413800 \h </w:instrText>
+          <w:instrText xml:space="preserve"> PAGEREF _Toc243417599 \h </w:instrText>
         </w:r>
         <w:r>
           <w:rPr>
@@ -824,7 +824,7 @@
           <w:noProof/>
         </w:rPr>
       </w:pPr>
-      <w:hyperlink w:anchor="_Toc243413801" w:history="1">
+      <w:hyperlink w:anchor="_Toc243417600" w:history="1">
         <w:r>
           <w:rPr>
             <w:rStyle w:val="Hyperlink"/>
@@ -851,7 +851,7 @@
             <w:noProof/>
             <w:webHidden/>
           </w:rPr>
-          <w:instrText xml:space="preserve"> PAGEREF _Toc243413801 \h </w:instrText>
+          <w:instrText xml:space="preserve"> PAGEREF _Toc243417600 \h </w:instrText>
         </w:r>
         <w:r>
           <w:rPr>
@@ -896,7 +896,7 @@
       <w:pPr>
         <w:pStyle w:val="Heading1"/>
       </w:pPr>
-      <w:bookmarkStart w:id="0" w:name="_Toc243413793"/>
+      <w:bookmarkStart w:id="0" w:name="_Toc243417592"/>
       <w:r>
         <w:lastRenderedPageBreak/>
         <w:t>1. Executive Summary</w:t>
@@ -1436,7 +1436,7 @@
       <w:pPr>
         <w:pStyle w:val="Heading1"/>
       </w:pPr>
-      <w:bookmarkStart w:id="1" w:name="_Toc243413794"/>
+      <w:bookmarkStart w:id="1" w:name="_Toc243417593"/>
       <w:r>
         <w:lastRenderedPageBreak/>
         <w:t>2. Introduction &amp; Business Context</w:t>
@@ -2180,7 +2180,7 @@
       <w:pPr>
         <w:pStyle w:val="Heading1"/>
       </w:pPr>
-      <w:bookmarkStart w:id="2" w:name="_Toc243413795"/>
+      <w:bookmarkStart w:id="2" w:name="_Toc243417594"/>
       <w:r>
         <w:t>3. Data Architecture &amp; Methodology</w:t>
       </w:r>
@@ -3184,7 +3184,7 @@
           <w:noProof/>
         </w:rPr>
         <w:drawing>
-          <wp:inline distT="0" distB="0" distL="0" distR="0" wp14:anchorId="3B079261" wp14:editId="2C875A6C">
+          <wp:inline distT="0" distB="0" distL="0" distR="0" wp14:anchorId="1F2CE29F" wp14:editId="17FE9D92">
             <wp:extent cx="6120000" cy="1200742"/>
             <wp:effectExtent l="0" t="0" r="0" b="0"/>
             <wp:docPr id="1" name="Picture 1"/>
@@ -3797,7 +3797,7 @@
       <w:pPr>
         <w:pStyle w:val="Heading1"/>
       </w:pPr>
-      <w:bookmarkStart w:id="3" w:name="_Toc243413796"/>
+      <w:bookmarkStart w:id="3" w:name="_Toc243417595"/>
       <w:r>
         <w:t>4. Implementation &amp; Results</w:t>
       </w:r>
@@ -3864,7 +3864,7 @@
           <w:noProof/>
         </w:rPr>
         <w:drawing>
-          <wp:inline distT="0" distB="0" distL="0" distR="0" wp14:anchorId="5FA4AA23" wp14:editId="4B1FF6CD">
+          <wp:inline distT="0" distB="0" distL="0" distR="0" wp14:anchorId="1DEF992C" wp14:editId="0BD3EA21">
             <wp:extent cx="5940000" cy="2268000"/>
             <wp:effectExtent l="0" t="0" r="0" b="0"/>
             <wp:docPr id="2" name="Picture 2"/>
@@ -4448,7 +4448,7 @@
           <w:noProof/>
         </w:rPr>
         <w:drawing>
-          <wp:inline distT="0" distB="0" distL="0" distR="0" wp14:anchorId="244BFA81" wp14:editId="11D5ED26">
+          <wp:inline distT="0" distB="0" distL="0" distR="0" wp14:anchorId="5BC9AFDB" wp14:editId="636C436A">
             <wp:extent cx="4500000" cy="2400000"/>
             <wp:effectExtent l="0" t="0" r="0" b="0"/>
             <wp:docPr id="3" name="Picture 3"/>
@@ -4518,7 +4518,7 @@
           <w:noProof/>
         </w:rPr>
         <w:drawing>
-          <wp:inline distT="0" distB="0" distL="0" distR="0" wp14:anchorId="56F78CD1" wp14:editId="71E208BC">
+          <wp:inline distT="0" distB="0" distL="0" distR="0" wp14:anchorId="4B633810" wp14:editId="386A8FA3">
             <wp:extent cx="3960000" cy="2436923"/>
             <wp:effectExtent l="0" t="0" r="0" b="0"/>
             <wp:docPr id="4" name="Picture 4"/>
@@ -4863,7 +4863,7 @@
           <w:noProof/>
         </w:rPr>
         <w:drawing>
-          <wp:inline distT="0" distB="0" distL="0" distR="0" wp14:anchorId="07761A33" wp14:editId="58D7BA6B">
+          <wp:inline distT="0" distB="0" distL="0" distR="0" wp14:anchorId="6B15212D" wp14:editId="24A6A7B2">
             <wp:extent cx="4680000" cy="2340000"/>
             <wp:effectExtent l="0" t="0" r="0" b="0"/>
             <wp:docPr id="5" name="Picture 5"/>
@@ -4938,7 +4938,7 @@
           <w:noProof/>
         </w:rPr>
         <w:drawing>
-          <wp:inline distT="0" distB="0" distL="0" distR="0" wp14:anchorId="671774EF" wp14:editId="09EDDB68">
+          <wp:inline distT="0" distB="0" distL="0" distR="0" wp14:anchorId="287C2451" wp14:editId="3D8A0A4C">
             <wp:extent cx="5940000" cy="2640000"/>
             <wp:effectExtent l="0" t="0" r="0" b="0"/>
             <wp:docPr id="6" name="Picture 6"/>
@@ -5430,7 +5430,7 @@
           <w:noProof/>
         </w:rPr>
         <w:drawing>
-          <wp:inline distT="0" distB="0" distL="0" distR="0" wp14:anchorId="0506CB73" wp14:editId="70B7A3C3">
+          <wp:inline distT="0" distB="0" distL="0" distR="0" wp14:anchorId="73B9DB66" wp14:editId="3C22D76F">
             <wp:extent cx="3780000" cy="2326154"/>
             <wp:effectExtent l="0" t="0" r="0" b="0"/>
             <wp:docPr id="7" name="Picture 7"/>
@@ -5489,7 +5489,7 @@
           <w:noProof/>
         </w:rPr>
         <w:drawing>
-          <wp:inline distT="0" distB="0" distL="0" distR="0" wp14:anchorId="50125764" wp14:editId="6AAF725D">
+          <wp:inline distT="0" distB="0" distL="0" distR="0" wp14:anchorId="1FAF8F13" wp14:editId="2D1085E6">
             <wp:extent cx="4860000" cy="3796875"/>
             <wp:effectExtent l="0" t="0" r="0" b="0"/>
             <wp:docPr id="8" name="Picture 8"/>
@@ -5568,7 +5568,7 @@
         </w:rPr>
         <w:lastRenderedPageBreak/>
         <w:drawing>
-          <wp:inline distT="0" distB="0" distL="0" distR="0" wp14:anchorId="67C34E39" wp14:editId="4A9CC4E3">
+          <wp:inline distT="0" distB="0" distL="0" distR="0" wp14:anchorId="6DED92A8" wp14:editId="4E202985">
             <wp:extent cx="4320000" cy="2304000"/>
             <wp:effectExtent l="0" t="0" r="0" b="0"/>
             <wp:docPr id="9" name="Picture 9"/>
@@ -6049,7 +6049,7 @@
       <w:pPr>
         <w:pStyle w:val="Heading1"/>
       </w:pPr>
-      <w:bookmarkStart w:id="4" w:name="_Toc243413797"/>
+      <w:bookmarkStart w:id="4" w:name="_Toc243417596"/>
       <w:r>
         <w:t>5. Strategic Deductions &amp; Business Impact</w:t>
       </w:r>
@@ -6619,7 +6619,7 @@
       <w:pPr>
         <w:pStyle w:val="Heading1"/>
       </w:pPr>
-      <w:bookmarkStart w:id="5" w:name="_Toc243413798"/>
+      <w:bookmarkStart w:id="5" w:name="_Toc243417597"/>
       <w:r>
         <w:t>6. Limitations &amp; Future Work</w:t>
       </w:r>
@@ -7186,7 +7186,7 @@
       <w:pPr>
         <w:pStyle w:val="Heading1"/>
       </w:pPr>
-      <w:bookmarkStart w:id="6" w:name="_Toc243413799"/>
+      <w:bookmarkStart w:id="6" w:name="_Toc243417598"/>
       <w:r>
         <w:lastRenderedPageBreak/>
         <w:t>Appendix A. Reproduction</w:t>
@@ -7208,7 +7208,20 @@
           <w:rFonts w:ascii="Consolas" w:hAnsi="Consolas"/>
           <w:sz w:val="19"/>
         </w:rPr>
-        <w:t>python -m evcharge.pipeline --source sample</w:t>
+        <w:t>pip install -r requirements.txt</w:t>
+      </w:r>
+      <w:r>
+        <w:t xml:space="preserve"> and </w:t>
+      </w:r>
+      <w:r>
+        <w:rPr>
+          <w:rFonts w:ascii="Consolas" w:hAnsi="Consolas"/>
+          <w:sz w:val="19"/>
+        </w:rPr>
+        <w:t>pip install -e ".[dev,orchestration,monitoring]"</w:t>
+      </w:r>
+      <w:r>
+        <w:t xml:space="preserve"> (the CI install; Python 3.11)</w:t>
       </w:r>
     </w:p>
     <w:p>
@@ -7221,7 +7234,7 @@
           <w:rFonts w:ascii="Consolas" w:hAnsi="Consolas"/>
           <w:sz w:val="19"/>
         </w:rPr>
-        <w:t>python -m pytest -q</w:t>
+        <w:t>python -m evcharge.pipeline --source sample</w:t>
       </w:r>
     </w:p>
     <w:p>
@@ -7234,32 +7247,7 @@
           <w:rFonts w:ascii="Consolas" w:hAnsi="Consolas"/>
           <w:sz w:val="19"/>
         </w:rPr>
-        <w:t>docker compose up --build -d</w:t>
-      </w:r>
-    </w:p>
-    <w:p>
-      <w:r>
-        <w:t xml:space="preserve">Licensed results (requires a free ACN-Data token as </w:t>
-      </w:r>
-      <w:r>
-        <w:rPr>
-          <w:rFonts w:ascii="Consolas" w:hAnsi="Consolas"/>
-          <w:sz w:val="19"/>
-        </w:rPr>
-        <w:t>ACN_API_TOKEN</w:t>
-      </w:r>
-      <w:r>
-        <w:t xml:space="preserve"> in </w:t>
-      </w:r>
-      <w:r>
-        <w:rPr>
-          <w:rFonts w:ascii="Consolas" w:hAnsi="Consolas"/>
-          <w:sz w:val="19"/>
-        </w:rPr>
-        <w:t>.env</w:t>
-      </w:r>
-      <w:r>
-        <w:t>):</w:t>
+        <w:t>python -m pytest -q</w:t>
       </w:r>
     </w:p>
     <w:p>
@@ -7272,27 +7260,32 @@
           <w:rFonts w:ascii="Consolas" w:hAnsi="Consolas"/>
           <w:sz w:val="19"/>
         </w:rPr>
-        <w:t>python -m evcharge.pipeline --source raw --fetch</w:t>
-      </w:r>
-      <w:r>
-        <w:t xml:space="preserve">, then compare </w:t>
+        <w:t>docker compose up --build -d</w:t>
+      </w:r>
+    </w:p>
+    <w:p>
+      <w:r>
+        <w:t xml:space="preserve">Licensed results (requires a free ACN-Data token as </w:t>
       </w:r>
       <w:r>
         <w:rPr>
           <w:rFonts w:ascii="Consolas" w:hAnsi="Consolas"/>
           <w:sz w:val="19"/>
         </w:rPr>
-        <w:t>data_sha256</w:t>
-      </w:r>
-      <w:r>
-        <w:t xml:space="preserve"> and split rows with </w:t>
+        <w:t>ACN_API_TOKEN</w:t>
+      </w:r>
+      <w:r>
+        <w:t xml:space="preserve"> in </w:t>
       </w:r>
       <w:r>
         <w:rPr>
           <w:rFonts w:ascii="Consolas" w:hAnsi="Consolas"/>
           <w:sz w:val="19"/>
         </w:rPr>
-        <w:t>benchmarks/licensed_baseline.json</w:t>
+        <w:t>.env</w:t>
+      </w:r>
+      <w:r>
+        <w:t>):</w:t>
       </w:r>
     </w:p>
     <w:p>
@@ -7305,7 +7298,27 @@
           <w:rFonts w:ascii="Consolas" w:hAnsi="Consolas"/>
           <w:sz w:val="19"/>
         </w:rPr>
-        <w:t>python -m evcharge.validation.reference --source raw</w:t>
+        <w:t>python -m evcharge.pipeline --source raw --fetch</w:t>
+      </w:r>
+      <w:r>
+        <w:t xml:space="preserve">, then compare </w:t>
+      </w:r>
+      <w:r>
+        <w:rPr>
+          <w:rFonts w:ascii="Consolas" w:hAnsi="Consolas"/>
+          <w:sz w:val="19"/>
+        </w:rPr>
+        <w:t>data_sha256</w:t>
+      </w:r>
+      <w:r>
+        <w:t xml:space="preserve"> and split rows with </w:t>
+      </w:r>
+      <w:r>
+        <w:rPr>
+          <w:rFonts w:ascii="Consolas" w:hAnsi="Consolas"/>
+          <w:sz w:val="19"/>
+        </w:rPr>
+        <w:t>benchmarks/licensed_baseline.json</w:t>
       </w:r>
     </w:p>
     <w:p>
@@ -7318,17 +7331,7 @@
           <w:rFonts w:ascii="Consolas" w:hAnsi="Consolas"/>
           <w:sz w:val="19"/>
         </w:rPr>
-        <w:t>python scripts/evaluate_drift.py</w:t>
-      </w:r>
-      <w:r>
-        <w:t xml:space="preserve"> and </w:t>
-      </w:r>
-      <w:r>
-        <w:rPr>
-          <w:rFonts w:ascii="Consolas" w:hAnsi="Consolas"/>
-          <w:sz w:val="19"/>
-        </w:rPr>
-        <w:t>python scripts/evaluate_retraining_recovery.py</w:t>
+        <w:t>python -m evcharge.validation.reference --source raw</w:t>
       </w:r>
     </w:p>
     <w:p>
@@ -7341,6 +7344,29 @@
           <w:rFonts w:ascii="Consolas" w:hAnsi="Consolas"/>
           <w:sz w:val="19"/>
         </w:rPr>
+        <w:t>python scripts/evaluate_drift.py</w:t>
+      </w:r>
+      <w:r>
+        <w:t xml:space="preserve"> and </w:t>
+      </w:r>
+      <w:r>
+        <w:rPr>
+          <w:rFonts w:ascii="Consolas" w:hAnsi="Consolas"/>
+          <w:sz w:val="19"/>
+        </w:rPr>
+        <w:t>python scripts/evaluate_retraining_recovery.py</w:t>
+      </w:r>
+    </w:p>
+    <w:p>
+      <w:pPr>
+        <w:pStyle w:val="ListBullet"/>
+        <w:spacing w:after="40"/>
+      </w:pPr>
+      <w:r>
+        <w:rPr>
+          <w:rFonts w:ascii="Consolas" w:hAnsi="Consolas"/>
+          <w:sz w:val="19"/>
+        </w:rPr>
         <w:t>python scripts/make_report_figures.py</w:t>
       </w:r>
       <w:r>
@@ -7356,7 +7382,7 @@
       <w:pPr>
         <w:pStyle w:val="Heading1"/>
       </w:pPr>
-      <w:bookmarkStart w:id="7" w:name="_Toc243413800"/>
+      <w:bookmarkStart w:id="7" w:name="_Toc243417599"/>
       <w:r>
         <w:t>Appendix B. References</w:t>
       </w:r>
@@ -7389,7 +7415,7 @@
       <w:pPr>
         <w:pStyle w:val="Heading1"/>
       </w:pPr>
-      <w:bookmarkStart w:id="8" w:name="_Toc243413801"/>
+      <w:bookmarkStart w:id="8" w:name="_Toc243417600"/>
       <w:r>
         <w:lastRenderedPageBreak/>
         <w:t>Appendix C. Detailed V2 architecture</w:t>
@@ -7406,7 +7432,7 @@
           <w:noProof/>
         </w:rPr>
         <w:drawing>
-          <wp:inline distT="0" distB="0" distL="0" distR="0" wp14:anchorId="7B3A0CAE" wp14:editId="7D0575B4">
+          <wp:inline distT="0" distB="0" distL="0" distR="0" wp14:anchorId="42E5C223" wp14:editId="035584FF">
             <wp:extent cx="6120000" cy="7738309"/>
             <wp:effectExtent l="0" t="0" r="0" b="0"/>
             <wp:docPr id="10" name="Picture 10"/>
@@ -7742,31 +7768,31 @@
       </w:rPr>
     </w:lvl>
   </w:abstractNum>
-  <w:num w:numId="1" w16cid:durableId="1659576168">
+  <w:num w:numId="1" w16cid:durableId="541020957">
     <w:abstractNumId w:val="8"/>
   </w:num>
-  <w:num w:numId="2" w16cid:durableId="1520045407">
+  <w:num w:numId="2" w16cid:durableId="1622565199">
     <w:abstractNumId w:val="6"/>
   </w:num>
-  <w:num w:numId="3" w16cid:durableId="98107420">
+  <w:num w:numId="3" w16cid:durableId="1816601268">
     <w:abstractNumId w:val="5"/>
   </w:num>
-  <w:num w:numId="4" w16cid:durableId="165630016">
+  <w:num w:numId="4" w16cid:durableId="1436438453">
     <w:abstractNumId w:val="4"/>
   </w:num>
-  <w:num w:numId="5" w16cid:durableId="1934821436">
+  <w:num w:numId="5" w16cid:durableId="1817720775">
     <w:abstractNumId w:val="7"/>
   </w:num>
-  <w:num w:numId="6" w16cid:durableId="2116049188">
+  <w:num w:numId="6" w16cid:durableId="1269197140">
     <w:abstractNumId w:val="3"/>
   </w:num>
-  <w:num w:numId="7" w16cid:durableId="1374767510">
+  <w:num w:numId="7" w16cid:durableId="782186765">
     <w:abstractNumId w:val="2"/>
   </w:num>
-  <w:num w:numId="8" w16cid:durableId="284820799">
+  <w:num w:numId="8" w16cid:durableId="235014095">
     <w:abstractNumId w:val="1"/>
   </w:num>
-  <w:num w:numId="9" w16cid:durableId="732392936">
+  <w:num w:numId="9" w16cid:durableId="611015155">
     <w:abstractNumId w:val="0"/>
   </w:num>
 </w:numbering>
@@ -19167,7 +19193,7 @@
     <w:autoRedefine/>
     <w:uiPriority w:val="39"/>
     <w:unhideWhenUsed/>
-    <w:rsid w:val="00E005C0"/>
+    <w:rsid w:val="000033F3"/>
     <w:pPr>
       <w:spacing w:after="100"/>
     </w:pPr>
@@ -19177,7 +19203,7 @@
     <w:basedOn w:val="DefaultParagraphFont"/>
     <w:uiPriority w:val="99"/>
     <w:unhideWhenUsed/>
-    <w:rsid w:val="00E005C0"/>
+    <w:rsid w:val="000033F3"/>
     <w:rPr>
       <w:color w:val="0000FF" w:themeColor="hyperlink"/>
       <w:u w:val="single"/>

</xml_diff>